<commit_message>
Primera versión que aplica criterios responsive para móvil
</commit_message>
<xml_diff>
--- a/documentación/Mejoras propuestas préstamos.docx
+++ b/documentación/Mejoras propuestas préstamos.docx
@@ -5,439 +5,18 @@
     <w:p>
       <w:pPr>
         <w:rPr>
-          <w:rFonts w:ascii="Cambria" w:hAnsi="Cambria" w:cs="Apple Color Emoji"/>
-          <w:b/>
-          <w:bCs/>
-          <w:color w:val="000000" w:themeColor="text1"/>
-        </w:rPr>
-      </w:pPr>
-      <w:r>
-        <w:rPr>
-          <w:rFonts w:ascii="Cambria" w:hAnsi="Cambria" w:cs="Apple Color Emoji"/>
-          <w:b/>
-          <w:bCs/>
-          <w:color w:val="000000" w:themeColor="text1"/>
-        </w:rPr>
-        <w:t xml:space="preserve">Préstamos y Contratos CCP (Esto ya se ha pedido y se ha interrumpido el desarrollo) </w:t>
-      </w:r>
-      <w:r>
-        <w:rPr>
-          <w:rFonts w:ascii="Cambria" w:hAnsi="Cambria" w:cs="Apple Color Emoji"/>
-          <w:b/>
-          <w:bCs/>
-          <w:color w:val="000000" w:themeColor="text1"/>
-        </w:rPr>
-        <w:sym w:font="Wingdings" w:char="F0E0"/>
-      </w:r>
-      <w:r>
-        <w:rPr>
-          <w:rFonts w:ascii="Cambria" w:hAnsi="Cambria" w:cs="Apple Color Emoji"/>
-          <w:b/>
-          <w:bCs/>
-          <w:color w:val="000000" w:themeColor="text1"/>
-        </w:rPr>
-        <w:t xml:space="preserve"> Terminarlo lo primero:</w:t>
-      </w:r>
-    </w:p>
-    <w:p>
-      <w:pPr>
-        <w:pStyle w:val="Prrafodelista"/>
-        <w:numPr>
-          <w:ilvl w:val="0"/>
-          <w:numId w:val="35"/>
-        </w:numPr>
-        <w:rPr>
-          <w:rFonts w:ascii="Cambria" w:hAnsi="Cambria" w:cs="Apple Color Emoji"/>
-          <w:color w:val="000000" w:themeColor="text1"/>
-        </w:rPr>
-      </w:pPr>
-      <w:r>
-        <w:rPr>
-          <w:rFonts w:ascii="Cambria" w:hAnsi="Cambria" w:cs="Apple Color Emoji"/>
-          <w:color w:val="000000" w:themeColor="text1"/>
-        </w:rPr>
-        <w:t xml:space="preserve">Quiero que hagamos una prueba. Igual acabamos retrocediendo. En Préstamos y en Contratos CCP, el detalle me lo presentas en una sola tarjeta, en lugar de mostrar un dato en cada tarjeta. Si es necesario separas por secciones (Por </w:t>
-      </w:r>
-      <w:proofErr w:type="gramStart"/>
-      <w:r>
-        <w:rPr>
-          <w:rFonts w:ascii="Cambria" w:hAnsi="Cambria" w:cs="Apple Color Emoji"/>
-          <w:color w:val="000000" w:themeColor="text1"/>
-        </w:rPr>
-        <w:t>ejemplo</w:t>
-      </w:r>
-      <w:proofErr w:type="gramEnd"/>
-      <w:r>
-        <w:rPr>
-          <w:rFonts w:ascii="Cambria" w:hAnsi="Cambria" w:cs="Apple Color Emoji"/>
-          <w:color w:val="000000" w:themeColor="text1"/>
-        </w:rPr>
-        <w:t xml:space="preserve"> Condiciones, Partes y Garantías en préstamos) y en Contratos CCP mostrarás dos tarjetas una con la información del préstamo y otra únicamente con las condiciones del contrato CCP</w:t>
-      </w:r>
-    </w:p>
-    <w:p>
-      <w:pPr>
-        <w:rPr>
-          <w:rFonts w:ascii="Cambria" w:hAnsi="Cambria" w:cs="Apple Color Emoji"/>
-          <w:b/>
-          <w:bCs/>
-          <w:color w:val="000000" w:themeColor="text1"/>
-        </w:rPr>
-      </w:pPr>
-    </w:p>
-    <w:p>
-      <w:pPr>
-        <w:rPr>
-          <w:rFonts w:ascii="Cambria" w:hAnsi="Cambria" w:cs="Apple Color Emoji"/>
-          <w:b/>
-          <w:bCs/>
-          <w:color w:val="000000" w:themeColor="text1"/>
-        </w:rPr>
-      </w:pPr>
-      <w:r>
-        <w:rPr>
-          <w:rFonts w:ascii="Cambria" w:hAnsi="Cambria" w:cs="Apple Color Emoji"/>
-          <w:b/>
-          <w:bCs/>
-          <w:color w:val="000000" w:themeColor="text1"/>
-        </w:rPr>
-        <w:t>Contratos CCP:</w:t>
-      </w:r>
-    </w:p>
-    <w:p>
-      <w:pPr>
-        <w:pStyle w:val="Prrafodelista"/>
-        <w:numPr>
-          <w:ilvl w:val="0"/>
-          <w:numId w:val="31"/>
-        </w:numPr>
-        <w:rPr>
-          <w:rFonts w:ascii="Cambria" w:hAnsi="Cambria" w:cs="Apple Color Emoji"/>
-          <w:color w:val="000000" w:themeColor="text1"/>
-        </w:rPr>
-      </w:pPr>
-      <w:r>
-        <w:rPr>
-          <w:rFonts w:ascii="Cambria" w:hAnsi="Cambria" w:cs="Apple Color Emoji"/>
-          <w:color w:val="000000" w:themeColor="text1"/>
-        </w:rPr>
-        <w:t>Cuando la edición está bloqueada no se ve la fecha de la firma.</w:t>
-      </w:r>
-    </w:p>
-    <w:p>
-      <w:pPr>
-        <w:pStyle w:val="Prrafodelista"/>
-        <w:numPr>
-          <w:ilvl w:val="0"/>
-          <w:numId w:val="30"/>
-        </w:numPr>
-        <w:rPr>
-          <w:rFonts w:ascii="Cambria" w:hAnsi="Cambria" w:cs="Apple Color Emoji"/>
-          <w:color w:val="000000" w:themeColor="text1"/>
-        </w:rPr>
-      </w:pPr>
-      <w:r>
-        <w:rPr>
-          <w:rFonts w:ascii="Cambria" w:hAnsi="Cambria" w:cs="Apple Color Emoji"/>
-          <w:color w:val="000000" w:themeColor="text1"/>
-        </w:rPr>
-        <w:t xml:space="preserve">Revisar: </w:t>
-      </w:r>
-      <w:r>
-        <w:rPr>
-          <w:rFonts w:ascii="Cambria" w:hAnsi="Cambria" w:cs="Apple Color Emoji"/>
-          <w:color w:val="000000" w:themeColor="text1"/>
-        </w:rPr>
-        <w:t>Efecto de un cobro parcial sobre el calendario de pagos:</w:t>
-      </w:r>
-    </w:p>
-    <w:p>
-      <w:pPr>
-        <w:pStyle w:val="Prrafodelista"/>
-        <w:numPr>
-          <w:ilvl w:val="1"/>
-          <w:numId w:val="30"/>
-        </w:numPr>
-        <w:rPr>
-          <w:rFonts w:ascii="Cambria" w:hAnsi="Cambria" w:cs="Apple Color Emoji"/>
-          <w:color w:val="000000" w:themeColor="text1"/>
-        </w:rPr>
-      </w:pPr>
-      <w:r>
-        <w:rPr>
-          <w:rFonts w:ascii="Cambria" w:hAnsi="Cambria" w:cs="Apple Color Emoji"/>
-          <w:color w:val="000000" w:themeColor="text1"/>
-        </w:rPr>
-        <w:t xml:space="preserve">Si se cobra parte de un vencimiento de un préstamo. </w:t>
-      </w:r>
-    </w:p>
-    <w:p>
-      <w:pPr>
-        <w:pStyle w:val="Prrafodelista"/>
-        <w:numPr>
-          <w:ilvl w:val="1"/>
-          <w:numId w:val="30"/>
-        </w:numPr>
-        <w:rPr>
-          <w:rFonts w:ascii="Cambria" w:hAnsi="Cambria" w:cs="Apple Color Emoji"/>
-          <w:color w:val="000000" w:themeColor="text1"/>
-        </w:rPr>
-      </w:pPr>
-      <w:r>
-        <w:rPr>
-          <w:rFonts w:ascii="Cambria" w:hAnsi="Cambria" w:cs="Apple Color Emoji"/>
-          <w:color w:val="000000" w:themeColor="text1"/>
-        </w:rPr>
-        <w:t>Ejemplo: se tenían que cobrar 1.000 € y se han cobrado 400 €</w:t>
-      </w:r>
-    </w:p>
-    <w:p>
-      <w:pPr>
-        <w:pStyle w:val="Prrafodelista"/>
-        <w:numPr>
-          <w:ilvl w:val="1"/>
-          <w:numId w:val="30"/>
-        </w:numPr>
-        <w:rPr>
-          <w:rFonts w:ascii="Cambria" w:hAnsi="Cambria" w:cs="Apple Color Emoji"/>
-          <w:color w:val="000000" w:themeColor="text1"/>
-        </w:rPr>
-      </w:pPr>
-      <w:r>
-        <w:rPr>
-          <w:rFonts w:ascii="Cambria" w:hAnsi="Cambria" w:cs="Apple Color Emoji"/>
-          <w:color w:val="000000" w:themeColor="text1"/>
-        </w:rPr>
-        <w:t>Si había un contrato partícipe con un 50% de participación en el préstamo:</w:t>
-      </w:r>
-    </w:p>
-    <w:p>
-      <w:pPr>
-        <w:pStyle w:val="Prrafodelista"/>
-        <w:numPr>
-          <w:ilvl w:val="1"/>
-          <w:numId w:val="30"/>
-        </w:numPr>
-        <w:rPr>
-          <w:rFonts w:ascii="Cambria" w:hAnsi="Cambria" w:cs="Apple Color Emoji"/>
-          <w:color w:val="000000" w:themeColor="text1"/>
-        </w:rPr>
-      </w:pPr>
-      <w:r>
-        <w:rPr>
-          <w:rFonts w:ascii="Cambria" w:hAnsi="Cambria" w:cs="Apple Color Emoji"/>
-          <w:color w:val="000000" w:themeColor="text1"/>
-        </w:rPr>
-        <w:t>En esa fecha en el calendario de pagos:</w:t>
-      </w:r>
-    </w:p>
-    <w:p>
-      <w:pPr>
-        <w:pStyle w:val="Prrafodelista"/>
-        <w:numPr>
-          <w:ilvl w:val="2"/>
-          <w:numId w:val="30"/>
-        </w:numPr>
-        <w:rPr>
-          <w:rFonts w:ascii="Cambria" w:hAnsi="Cambria" w:cs="Apple Color Emoji"/>
-          <w:color w:val="000000" w:themeColor="text1"/>
-        </w:rPr>
-      </w:pPr>
-      <w:r>
-        <w:rPr>
-          <w:rFonts w:ascii="Cambria" w:hAnsi="Cambria" w:cs="Apple Color Emoji"/>
-          <w:color w:val="000000" w:themeColor="text1"/>
-        </w:rPr>
-        <w:t>Aparecerá el Beneficio del 100% de la cuota.</w:t>
-      </w:r>
-    </w:p>
-    <w:p>
-      <w:pPr>
-        <w:pStyle w:val="Prrafodelista"/>
-        <w:numPr>
-          <w:ilvl w:val="2"/>
-          <w:numId w:val="30"/>
-        </w:numPr>
-        <w:rPr>
-          <w:rFonts w:ascii="Cambria" w:hAnsi="Cambria" w:cs="Apple Color Emoji"/>
-          <w:color w:val="000000" w:themeColor="text1"/>
-        </w:rPr>
-      </w:pPr>
-      <w:r>
-        <w:rPr>
-          <w:rFonts w:ascii="Cambria" w:hAnsi="Cambria" w:cs="Apple Color Emoji"/>
-          <w:color w:val="000000" w:themeColor="text1"/>
-        </w:rPr>
-        <w:t>Pero en Devengado aparecerá el 50% y en pendiente el otro 50%.</w:t>
-      </w:r>
-    </w:p>
-    <w:p>
-      <w:pPr>
-        <w:pStyle w:val="Prrafodelista"/>
-        <w:numPr>
-          <w:ilvl w:val="2"/>
-          <w:numId w:val="30"/>
-        </w:numPr>
-        <w:rPr>
-          <w:rFonts w:ascii="Cambria" w:hAnsi="Cambria" w:cs="Apple Color Emoji"/>
-          <w:color w:val="000000" w:themeColor="text1"/>
-        </w:rPr>
-      </w:pPr>
-      <w:r>
-        <w:rPr>
-          <w:rFonts w:ascii="Cambria" w:hAnsi="Cambria" w:cs="Apple Color Emoji"/>
-          <w:color w:val="000000" w:themeColor="text1"/>
-        </w:rPr>
-        <w:t>Si se paga esa parte del contrato CCP, habrá 50% en pagado y el 50% en pendiente.</w:t>
-      </w:r>
-    </w:p>
-    <w:p>
-      <w:pPr>
-        <w:rPr>
-          <w:rFonts w:ascii="Cambria" w:hAnsi="Cambria" w:cs="Apple Color Emoji"/>
-          <w:color w:val="000000" w:themeColor="text1"/>
-        </w:rPr>
-      </w:pPr>
-    </w:p>
-    <w:p>
-      <w:pPr>
-        <w:rPr>
           <w:b/>
           <w:bCs/>
           <w:color w:val="FF0000"/>
         </w:rPr>
       </w:pPr>
-    </w:p>
-    <w:p>
-      <w:pPr>
+      <w:r>
         <w:rPr>
           <w:b/>
           <w:bCs/>
           <w:color w:val="FF0000"/>
         </w:rPr>
-      </w:pPr>
-    </w:p>
-    <w:p>
-      <w:pPr>
-        <w:rPr>
-          <w:b/>
-          <w:bCs/>
-          <w:color w:val="000000" w:themeColor="text1"/>
-        </w:rPr>
-      </w:pPr>
-      <w:proofErr w:type="spellStart"/>
-      <w:r>
-        <w:rPr>
-          <w:b/>
-          <w:bCs/>
-          <w:color w:val="000000" w:themeColor="text1"/>
-        </w:rPr>
-        <w:t>KPIs</w:t>
-      </w:r>
-      <w:proofErr w:type="spellEnd"/>
-      <w:r>
-        <w:rPr>
-          <w:b/>
-          <w:bCs/>
-          <w:color w:val="000000" w:themeColor="text1"/>
-        </w:rPr>
-        <w:t xml:space="preserve"> </w:t>
-      </w:r>
-      <w:r>
-        <w:rPr>
-          <w:b/>
-          <w:bCs/>
-          <w:color w:val="000000" w:themeColor="text1"/>
-        </w:rPr>
-        <w:t>C</w:t>
-      </w:r>
-      <w:r>
-        <w:rPr>
-          <w:b/>
-          <w:bCs/>
-          <w:color w:val="000000" w:themeColor="text1"/>
-        </w:rPr>
-        <w:t>ontratos CCP:</w:t>
-      </w:r>
-    </w:p>
-    <w:p>
-      <w:pPr>
-        <w:rPr>
-          <w:color w:val="000000" w:themeColor="text1"/>
-        </w:rPr>
-      </w:pPr>
-      <w:r>
-        <w:rPr>
-          <w:b/>
-          <w:bCs/>
-          <w:color w:val="000000" w:themeColor="text1"/>
-        </w:rPr>
-        <w:tab/>
-      </w:r>
-      <w:r>
-        <w:rPr>
-          <w:color w:val="000000" w:themeColor="text1"/>
-        </w:rPr>
-        <w:t>Importe participación activ</w:t>
-      </w:r>
-      <w:r>
-        <w:rPr>
-          <w:color w:val="000000" w:themeColor="text1"/>
-        </w:rPr>
-        <w:t>o</w:t>
-      </w:r>
-      <w:r>
-        <w:rPr>
-          <w:color w:val="000000" w:themeColor="text1"/>
-        </w:rPr>
-        <w:t xml:space="preserve"> </w:t>
-      </w:r>
-      <w:r>
-        <w:rPr>
-          <w:color w:val="000000" w:themeColor="text1"/>
-        </w:rPr>
-        <w:sym w:font="Wingdings" w:char="F0E0"/>
-      </w:r>
-      <w:r>
-        <w:rPr>
-          <w:color w:val="000000" w:themeColor="text1"/>
-        </w:rPr>
-        <w:t xml:space="preserve"> Violeta</w:t>
-      </w:r>
-    </w:p>
-    <w:p>
-      <w:pPr>
-        <w:rPr>
-          <w:b/>
-          <w:bCs/>
-          <w:color w:val="FF0000"/>
-        </w:rPr>
-      </w:pPr>
-    </w:p>
-    <w:p>
-      <w:pPr>
-        <w:rPr>
-          <w:b/>
-          <w:bCs/>
-          <w:color w:val="FF0000"/>
-        </w:rPr>
-      </w:pPr>
-    </w:p>
-    <w:p>
-      <w:pPr>
-        <w:rPr>
-          <w:b/>
-          <w:bCs/>
-          <w:color w:val="FF0000"/>
-        </w:rPr>
-      </w:pPr>
-      <w:r>
-        <w:rPr>
-          <w:b/>
-          <w:bCs/>
-          <w:color w:val="FF0000"/>
-        </w:rPr>
-        <w:t>Partícipes (un partícipe):</w:t>
+        <w:t xml:space="preserve">Hacer más fluida la pantalla. </w:t>
       </w:r>
     </w:p>
     <w:p>
@@ -448,20 +27,54 @@
           <w:numId w:val="16"/>
         </w:numPr>
         <w:rPr>
+          <w:b/>
+          <w:bCs/>
           <w:color w:val="FF0000"/>
         </w:rPr>
       </w:pPr>
       <w:r>
         <w:rPr>
+          <w:b/>
+          <w:bCs/>
           <w:color w:val="FF0000"/>
         </w:rPr>
-        <w:t>En la lista de contratos CCP</w:t>
-      </w:r>
-      <w:r>
-        <w:rPr>
+        <w:t xml:space="preserve">Por </w:t>
+      </w:r>
+      <w:proofErr w:type="gramStart"/>
+      <w:r>
+        <w:rPr>
+          <w:b/>
+          <w:bCs/>
           <w:color w:val="FF0000"/>
         </w:rPr>
-        <w:t xml:space="preserve"> Asociados</w:t>
+        <w:t>ejemplo</w:t>
+      </w:r>
+      <w:proofErr w:type="gramEnd"/>
+      <w:r>
+        <w:rPr>
+          <w:b/>
+          <w:bCs/>
+          <w:color w:val="FF0000"/>
+        </w:rPr>
+        <w:t xml:space="preserve"> los </w:t>
+      </w:r>
+      <w:proofErr w:type="spellStart"/>
+      <w:r>
+        <w:rPr>
+          <w:b/>
+          <w:bCs/>
+          <w:color w:val="FF0000"/>
+        </w:rPr>
+        <w:t>KPIs</w:t>
+      </w:r>
+      <w:proofErr w:type="spellEnd"/>
+      <w:r>
+        <w:rPr>
+          <w:b/>
+          <w:bCs/>
+          <w:color w:val="FF0000"/>
+        </w:rPr>
+        <w:t xml:space="preserve"> tiene que poder </w:t>
       </w:r>
     </w:p>
     <w:p>
@@ -472,33 +85,448 @@
           <w:numId w:val="16"/>
         </w:numPr>
         <w:rPr>
+          <w:b/>
+          <w:bCs/>
           <w:color w:val="FF0000"/>
         </w:rPr>
       </w:pPr>
       <w:r>
         <w:rPr>
+          <w:b/>
+          <w:bCs/>
           <w:color w:val="FF0000"/>
         </w:rPr>
-        <w:t>Estado préstamo</w:t>
-      </w:r>
-      <w:r>
-        <w:rPr>
+        <w:t>O reducir su tamaño cuando no se pueda ver su contenido.</w:t>
+      </w:r>
+    </w:p>
+    <w:p>
+      <w:pPr>
+        <w:pStyle w:val="Prrafodelista"/>
+        <w:numPr>
+          <w:ilvl w:val="1"/>
+          <w:numId w:val="16"/>
+        </w:numPr>
+        <w:rPr>
+          <w:b/>
+          <w:bCs/>
           <w:color w:val="FF0000"/>
         </w:rPr>
-        <w:t xml:space="preserve"> </w:t>
-      </w:r>
-      <w:r>
-        <w:rPr>
+      </w:pPr>
+      <w:r>
+        <w:rPr>
+          <w:b/>
+          <w:bCs/>
           <w:color w:val="FF0000"/>
         </w:rPr>
+        <w:t>O presentarse en más filas (menos columnas).</w:t>
+      </w:r>
+    </w:p>
+    <w:p>
+      <w:pPr>
+        <w:pStyle w:val="Prrafodelista"/>
+        <w:numPr>
+          <w:ilvl w:val="1"/>
+          <w:numId w:val="16"/>
+        </w:numPr>
+        <w:rPr>
+          <w:b/>
+          <w:bCs/>
+          <w:color w:val="FF0000"/>
+        </w:rPr>
+      </w:pPr>
+      <w:r>
+        <w:rPr>
+          <w:b/>
+          <w:bCs/>
+          <w:color w:val="FF0000"/>
+        </w:rPr>
+        <w:t>También podrían tener una distribución y presentación diferente en función del tamaño del dispositivo.</w:t>
+      </w:r>
+    </w:p>
+    <w:p>
+      <w:pPr>
+        <w:pStyle w:val="Prrafodelista"/>
+        <w:numPr>
+          <w:ilvl w:val="1"/>
+          <w:numId w:val="16"/>
+        </w:numPr>
+        <w:rPr>
+          <w:b/>
+          <w:bCs/>
+          <w:color w:val="FF0000"/>
+        </w:rPr>
+      </w:pPr>
+      <w:r>
+        <w:rPr>
+          <w:b/>
+          <w:bCs/>
+          <w:color w:val="FF0000"/>
+        </w:rPr>
+        <w:t xml:space="preserve">O reducir el contenido o formato, por </w:t>
+      </w:r>
+      <w:proofErr w:type="gramStart"/>
+      <w:r>
+        <w:rPr>
+          <w:b/>
+          <w:bCs/>
+          <w:color w:val="FF0000"/>
+        </w:rPr>
+        <w:t>ejemplo</w:t>
+      </w:r>
+      <w:proofErr w:type="gramEnd"/>
+      <w:r>
+        <w:rPr>
+          <w:b/>
+          <w:bCs/>
+          <w:color w:val="FF0000"/>
+        </w:rPr>
+        <w:t xml:space="preserve"> en dispositivos más pequeños, en el </w:t>
+      </w:r>
+      <w:proofErr w:type="spellStart"/>
+      <w:r>
+        <w:rPr>
+          <w:b/>
+          <w:bCs/>
+          <w:color w:val="FF0000"/>
+        </w:rPr>
+        <w:t>dashboard</w:t>
+      </w:r>
+      <w:proofErr w:type="spellEnd"/>
+      <w:r>
+        <w:rPr>
+          <w:b/>
+          <w:bCs/>
+          <w:color w:val="FF0000"/>
+        </w:rPr>
+        <w:t xml:space="preserve">, presentar los € en miles sin poner € </w:t>
+      </w:r>
+      <w:r>
+        <w:rPr>
+          <w:b/>
+          <w:bCs/>
+          <w:color w:val="FF0000"/>
+        </w:rPr>
         <w:sym w:font="Wingdings" w:char="F0E0"/>
       </w:r>
       <w:r>
         <w:rPr>
+          <w:b/>
+          <w:bCs/>
           <w:color w:val="FF0000"/>
         </w:rPr>
-        <w:t xml:space="preserve"> Presentarlo igual que la columna Estado en préstamos</w:t>
-      </w:r>
+        <w:t xml:space="preserve"> especificar en la cabecera cifras en K€, no presentar los gráficos </w:t>
+      </w:r>
+      <w:proofErr w:type="spellStart"/>
+      <w:r>
+        <w:rPr>
+          <w:b/>
+          <w:bCs/>
+          <w:color w:val="FF0000"/>
+        </w:rPr>
+        <w:t>de</w:t>
+      </w:r>
+      <w:proofErr w:type="spellEnd"/>
+      <w:r>
+        <w:rPr>
+          <w:b/>
+          <w:bCs/>
+          <w:color w:val="FF0000"/>
+        </w:rPr>
+        <w:t xml:space="preserve"> % de capital y % de capital activo. Esto es un ejemplo, analizar que se puede hacer en toda la aplicación.</w:t>
+      </w:r>
+    </w:p>
+    <w:p>
+      <w:pPr>
+        <w:rPr>
+          <w:b/>
+          <w:bCs/>
+          <w:color w:val="FF0000"/>
+        </w:rPr>
+      </w:pPr>
+    </w:p>
+    <w:p>
+      <w:pPr>
+        <w:pStyle w:val="Prrafodelista"/>
+        <w:ind w:left="1440"/>
+        <w:rPr>
+          <w:b/>
+          <w:bCs/>
+          <w:color w:val="FF0000"/>
+        </w:rPr>
+      </w:pPr>
+    </w:p>
+    <w:p>
+      <w:pPr>
+        <w:pStyle w:val="Prrafodelista"/>
+        <w:numPr>
+          <w:ilvl w:val="0"/>
+          <w:numId w:val="16"/>
+        </w:numPr>
+        <w:rPr>
+          <w:b/>
+          <w:bCs/>
+          <w:color w:val="FF0000"/>
+        </w:rPr>
+      </w:pPr>
+      <w:r>
+        <w:rPr>
+          <w:b/>
+          <w:bCs/>
+          <w:color w:val="FF0000"/>
+        </w:rPr>
+        <w:t>Mejorar su funcionamiento en un móvil. Por ejemplo, en un móvil, el menú de la izquierda no tiene que quedarse fijo.</w:t>
+      </w:r>
+    </w:p>
+    <w:p>
+      <w:pPr>
+        <w:rPr>
+          <w:b/>
+          <w:bCs/>
+          <w:color w:val="FF0000"/>
+        </w:rPr>
+      </w:pPr>
+    </w:p>
+    <w:p>
+      <w:pPr>
+        <w:rPr>
+          <w:b/>
+          <w:bCs/>
+          <w:color w:val="FF0000"/>
+        </w:rPr>
+      </w:pPr>
+      <w:r>
+        <w:rPr>
+          <w:b/>
+          <w:bCs/>
+          <w:color w:val="FF0000"/>
+        </w:rPr>
+        <w:t>Empezar a plantear 2 o 3 entornos:</w:t>
+      </w:r>
+    </w:p>
+    <w:p>
+      <w:pPr>
+        <w:pStyle w:val="Prrafodelista"/>
+        <w:numPr>
+          <w:ilvl w:val="0"/>
+          <w:numId w:val="16"/>
+        </w:numPr>
+        <w:rPr>
+          <w:b/>
+          <w:bCs/>
+          <w:color w:val="FF0000"/>
+        </w:rPr>
+      </w:pPr>
+      <w:r>
+        <w:rPr>
+          <w:b/>
+          <w:bCs/>
+          <w:color w:val="FF0000"/>
+        </w:rPr>
+        <w:t>Desarrollo</w:t>
+      </w:r>
+    </w:p>
+    <w:p>
+      <w:pPr>
+        <w:pStyle w:val="Prrafodelista"/>
+        <w:numPr>
+          <w:ilvl w:val="0"/>
+          <w:numId w:val="16"/>
+        </w:numPr>
+        <w:rPr>
+          <w:b/>
+          <w:bCs/>
+          <w:color w:val="FF0000"/>
+        </w:rPr>
+      </w:pPr>
+      <w:r>
+        <w:rPr>
+          <w:b/>
+          <w:bCs/>
+          <w:color w:val="FF0000"/>
+        </w:rPr>
+        <w:t>Test</w:t>
+      </w:r>
+    </w:p>
+    <w:p>
+      <w:pPr>
+        <w:pStyle w:val="Prrafodelista"/>
+        <w:numPr>
+          <w:ilvl w:val="0"/>
+          <w:numId w:val="16"/>
+        </w:numPr>
+        <w:rPr>
+          <w:b/>
+          <w:bCs/>
+          <w:color w:val="FF0000"/>
+        </w:rPr>
+      </w:pPr>
+      <w:r>
+        <w:rPr>
+          <w:b/>
+          <w:bCs/>
+          <w:color w:val="FF0000"/>
+        </w:rPr>
+        <w:t>Producción</w:t>
+      </w:r>
+    </w:p>
+    <w:p>
+      <w:pPr>
+        <w:rPr>
+          <w:b/>
+          <w:bCs/>
+          <w:color w:val="FF0000"/>
+        </w:rPr>
+      </w:pPr>
+    </w:p>
+    <w:p>
+      <w:pPr>
+        <w:rPr>
+          <w:b/>
+          <w:bCs/>
+          <w:color w:val="FF0000"/>
+        </w:rPr>
+      </w:pPr>
+      <w:r>
+        <w:rPr>
+          <w:b/>
+          <w:bCs/>
+          <w:color w:val="FF0000"/>
+        </w:rPr>
+        <w:t xml:space="preserve">Plantear test de funcionamiento de los calendarios y de determinados </w:t>
+      </w:r>
+      <w:proofErr w:type="spellStart"/>
+      <w:r>
+        <w:rPr>
+          <w:b/>
+          <w:bCs/>
+          <w:color w:val="FF0000"/>
+        </w:rPr>
+        <w:t>KPIs</w:t>
+      </w:r>
+      <w:proofErr w:type="spellEnd"/>
+      <w:r>
+        <w:rPr>
+          <w:b/>
+          <w:bCs/>
+          <w:color w:val="FF0000"/>
+        </w:rPr>
+        <w:t>.</w:t>
+      </w:r>
+    </w:p>
+    <w:p>
+      <w:pPr>
+        <w:rPr>
+          <w:b/>
+          <w:bCs/>
+          <w:color w:val="FF0000"/>
+        </w:rPr>
+      </w:pPr>
+    </w:p>
+    <w:p>
+      <w:pPr>
+        <w:rPr>
+          <w:b/>
+          <w:bCs/>
+          <w:color w:val="FF0000"/>
+        </w:rPr>
+      </w:pPr>
+    </w:p>
+    <w:p>
+      <w:pPr>
+        <w:rPr>
+          <w:b/>
+          <w:bCs/>
+          <w:color w:val="FF0000"/>
+        </w:rPr>
+      </w:pPr>
+    </w:p>
+    <w:p>
+      <w:pPr>
+        <w:rPr>
+          <w:b/>
+          <w:bCs/>
+        </w:rPr>
+      </w:pPr>
+    </w:p>
+    <w:p>
+      <w:pPr>
+        <w:pStyle w:val="Ttulo"/>
+      </w:pPr>
+      <w:r>
+        <w:t>Tema CIRBE</w:t>
+      </w:r>
+    </w:p>
+    <w:p>
+      <w:pPr>
+        <w:rPr>
+          <w:b/>
+          <w:bCs/>
+        </w:rPr>
+      </w:pPr>
+    </w:p>
+    <w:p>
+      <w:pPr>
+        <w:rPr>
+          <w:b/>
+          <w:bCs/>
+        </w:rPr>
+      </w:pPr>
+      <w:r>
+        <w:rPr>
+          <w:b/>
+          <w:bCs/>
+        </w:rPr>
+        <w:t xml:space="preserve">Existirá una tabla </w:t>
+      </w:r>
+      <w:r>
+        <w:rPr>
+          <w:b/>
+          <w:bCs/>
+        </w:rPr>
+        <w:t>con los tipos de identificación</w:t>
+      </w:r>
+    </w:p>
+    <w:p>
+      <w:pPr>
+        <w:pStyle w:val="Prrafodelista"/>
+        <w:numPr>
+          <w:ilvl w:val="0"/>
+          <w:numId w:val="16"/>
+        </w:numPr>
+        <w:rPr>
+          <w:b/>
+          <w:bCs/>
+        </w:rPr>
+      </w:pPr>
+      <w:r>
+        <w:rPr>
+          <w:b/>
+          <w:bCs/>
+        </w:rPr>
+        <w:t>Nombre de la tabla interna</w:t>
+      </w:r>
+    </w:p>
+    <w:p>
+      <w:pPr>
+        <w:pStyle w:val="Prrafodelista"/>
+        <w:numPr>
+          <w:ilvl w:val="1"/>
+          <w:numId w:val="16"/>
+        </w:numPr>
+        <w:rPr>
+          <w:b/>
+          <w:bCs/>
+        </w:rPr>
+      </w:pPr>
+      <w:proofErr w:type="spellStart"/>
+      <w:r>
+        <w:rPr>
+          <w:b/>
+          <w:bCs/>
+        </w:rPr>
+        <w:t>BdE_Tipos_id</w:t>
+      </w:r>
+      <w:proofErr w:type="spellEnd"/>
     </w:p>
     <w:p>
       <w:pPr>
@@ -508,45 +536,26 @@
           <w:numId w:val="16"/>
         </w:numPr>
         <w:rPr>
-          <w:color w:val="FF0000"/>
-        </w:rPr>
-      </w:pPr>
-      <w:r>
-        <w:rPr>
-          <w:color w:val="FF0000"/>
-        </w:rPr>
-        <w:t>Al día</w:t>
-      </w:r>
-      <w:r>
-        <w:rPr>
-          <w:color w:val="FF0000"/>
-        </w:rPr>
-        <w:t xml:space="preserve"> </w:t>
-      </w:r>
-      <w:r>
-        <w:rPr>
-          <w:color w:val="FF0000"/>
-        </w:rPr>
-        <w:sym w:font="Wingdings" w:char="F0E0"/>
-      </w:r>
-      <w:r>
-        <w:rPr>
-          <w:color w:val="FF0000"/>
-        </w:rPr>
-        <w:t xml:space="preserve"> </w:t>
-      </w:r>
-      <w:r>
-        <w:rPr>
-          <w:color w:val="FF0000"/>
-        </w:rPr>
-        <w:t xml:space="preserve">etiqueta </w:t>
-      </w:r>
-      <w:r>
-        <w:rPr>
-          <w:color w:val="FF0000"/>
-        </w:rPr>
-        <w:t>Verde</w:t>
-      </w:r>
+          <w:b/>
+          <w:bCs/>
+        </w:rPr>
+      </w:pPr>
+      <w:r>
+        <w:rPr>
+          <w:b/>
+          <w:bCs/>
+        </w:rPr>
+        <w:t xml:space="preserve">id: </w:t>
+      </w:r>
+      <w:proofErr w:type="spellStart"/>
+      <w:r>
+        <w:rPr>
+          <w:b/>
+          <w:bCs/>
+        </w:rPr>
+        <w:t>varchar</w:t>
+      </w:r>
+      <w:proofErr w:type="spellEnd"/>
     </w:p>
     <w:p>
       <w:pPr>
@@ -556,45 +565,59 @@
           <w:numId w:val="16"/>
         </w:numPr>
         <w:rPr>
-          <w:color w:val="FF0000"/>
-        </w:rPr>
-      </w:pPr>
-      <w:r>
-        <w:rPr>
-          <w:color w:val="FF0000"/>
-        </w:rPr>
-        <w:t>Con retraso</w:t>
-      </w:r>
-      <w:r>
-        <w:rPr>
-          <w:color w:val="FF0000"/>
-        </w:rPr>
-        <w:t xml:space="preserve"> </w:t>
-      </w:r>
-      <w:r>
-        <w:rPr>
-          <w:color w:val="FF0000"/>
-        </w:rPr>
-        <w:sym w:font="Wingdings" w:char="F0E0"/>
-      </w:r>
-      <w:r>
-        <w:rPr>
-          <w:color w:val="FF0000"/>
-        </w:rPr>
-        <w:t xml:space="preserve"> </w:t>
-      </w:r>
-      <w:r>
-        <w:rPr>
-          <w:color w:val="FF0000"/>
-        </w:rPr>
-        <w:t xml:space="preserve">etiqueta </w:t>
-      </w:r>
-      <w:r>
-        <w:rPr>
-          <w:color w:val="FF0000"/>
-        </w:rPr>
-        <w:t>Naranja</w:t>
-      </w:r>
+          <w:b/>
+          <w:bCs/>
+        </w:rPr>
+      </w:pPr>
+      <w:r>
+        <w:rPr>
+          <w:b/>
+          <w:bCs/>
+        </w:rPr>
+        <w:t>descripción: Text</w:t>
+      </w:r>
+    </w:p>
+    <w:p>
+      <w:pPr>
+        <w:pStyle w:val="Prrafodelista"/>
+        <w:numPr>
+          <w:ilvl w:val="0"/>
+          <w:numId w:val="16"/>
+        </w:numPr>
+        <w:rPr>
+          <w:b/>
+          <w:bCs/>
+        </w:rPr>
+      </w:pPr>
+      <w:r>
+        <w:rPr>
+          <w:b/>
+          <w:bCs/>
+        </w:rPr>
+        <w:t>Nombre de otra tabla interna:</w:t>
+      </w:r>
+    </w:p>
+    <w:p>
+      <w:pPr>
+        <w:pStyle w:val="Prrafodelista"/>
+        <w:numPr>
+          <w:ilvl w:val="1"/>
+          <w:numId w:val="16"/>
+        </w:numPr>
+        <w:rPr>
+          <w:b/>
+          <w:bCs/>
+        </w:rPr>
+      </w:pPr>
+      <w:proofErr w:type="spellStart"/>
+      <w:r>
+        <w:rPr>
+          <w:b/>
+          <w:bCs/>
+        </w:rPr>
+        <w:t>BdE_Sectores</w:t>
+      </w:r>
+      <w:proofErr w:type="spellEnd"/>
     </w:p>
     <w:p>
       <w:pPr>
@@ -604,45 +627,35 @@
           <w:numId w:val="16"/>
         </w:numPr>
         <w:rPr>
-          <w:color w:val="FF0000"/>
-        </w:rPr>
-      </w:pPr>
-      <w:r>
-        <w:rPr>
-          <w:color w:val="FF0000"/>
-        </w:rPr>
-        <w:t>Judicializado</w:t>
-      </w:r>
-      <w:r>
-        <w:rPr>
-          <w:color w:val="FF0000"/>
-        </w:rPr>
-        <w:t xml:space="preserve"> </w:t>
-      </w:r>
-      <w:r>
-        <w:rPr>
-          <w:color w:val="FF0000"/>
-        </w:rPr>
-        <w:sym w:font="Wingdings" w:char="F0E0"/>
-      </w:r>
-      <w:r>
-        <w:rPr>
-          <w:color w:val="FF0000"/>
-        </w:rPr>
-        <w:t xml:space="preserve"> </w:t>
-      </w:r>
-      <w:r>
-        <w:rPr>
-          <w:color w:val="FF0000"/>
-        </w:rPr>
-        <w:t xml:space="preserve">etiqueta </w:t>
-      </w:r>
-      <w:r>
-        <w:rPr>
-          <w:color w:val="FF0000"/>
-        </w:rPr>
-        <w:t>Rojo</w:t>
-      </w:r>
+          <w:b/>
+          <w:bCs/>
+        </w:rPr>
+      </w:pPr>
+      <w:proofErr w:type="spellStart"/>
+      <w:r>
+        <w:rPr>
+          <w:b/>
+          <w:bCs/>
+        </w:rPr>
+        <w:t>codigo</w:t>
+      </w:r>
+      <w:proofErr w:type="spellEnd"/>
+      <w:r>
+        <w:rPr>
+          <w:b/>
+          <w:bCs/>
+        </w:rPr>
+        <w:t xml:space="preserve">: </w:t>
+      </w:r>
+      <w:proofErr w:type="spellStart"/>
+      <w:r>
+        <w:rPr>
+          <w:b/>
+          <w:bCs/>
+        </w:rPr>
+        <w:t>varchar</w:t>
+      </w:r>
+      <w:proofErr w:type="spellEnd"/>
     </w:p>
     <w:p>
       <w:pPr>
@@ -652,85 +665,16 @@
           <w:numId w:val="16"/>
         </w:numPr>
         <w:rPr>
-          <w:color w:val="FF0000"/>
-        </w:rPr>
-      </w:pPr>
-      <w:r>
-        <w:rPr>
-          <w:color w:val="FF0000"/>
-        </w:rPr>
-        <w:t>Cancelado</w:t>
-      </w:r>
-      <w:r>
-        <w:rPr>
-          <w:color w:val="FF0000"/>
-        </w:rPr>
-        <w:t xml:space="preserve"> </w:t>
-      </w:r>
-      <w:r>
-        <w:rPr>
-          <w:color w:val="FF0000"/>
-        </w:rPr>
-        <w:sym w:font="Wingdings" w:char="F0E0"/>
-      </w:r>
-      <w:r>
-        <w:rPr>
-          <w:color w:val="FF0000"/>
-        </w:rPr>
-        <w:t xml:space="preserve"> </w:t>
-      </w:r>
-      <w:r>
-        <w:rPr>
-          <w:color w:val="FF0000"/>
-        </w:rPr>
-        <w:t xml:space="preserve">etiqueta </w:t>
-      </w:r>
-      <w:r>
-        <w:rPr>
-          <w:color w:val="FF0000"/>
-        </w:rPr>
-        <w:t>Gri</w:t>
-      </w:r>
-      <w:r>
-        <w:rPr>
-          <w:color w:val="FF0000"/>
-        </w:rPr>
-        <w:t>s</w:t>
-      </w:r>
-    </w:p>
-    <w:p>
-      <w:pPr>
-        <w:rPr>
-          <w:b/>
-          <w:bCs/>
-          <w:color w:val="FF0000"/>
-        </w:rPr>
-      </w:pPr>
-    </w:p>
-    <w:p>
-      <w:pPr>
-        <w:rPr>
-          <w:b/>
-          <w:bCs/>
-          <w:color w:val="FF0000"/>
-        </w:rPr>
-      </w:pPr>
-    </w:p>
-    <w:p>
-      <w:pPr>
-        <w:rPr>
-          <w:b/>
-          <w:bCs/>
-          <w:color w:val="FF0000"/>
-        </w:rPr>
-      </w:pPr>
-      <w:r>
-        <w:rPr>
-          <w:b/>
-          <w:bCs/>
-          <w:color w:val="FF0000"/>
-        </w:rPr>
-        <w:t xml:space="preserve">Hacer más fluida la pantalla. </w:t>
+          <w:b/>
+          <w:bCs/>
+        </w:rPr>
+      </w:pPr>
+      <w:r>
+        <w:rPr>
+          <w:b/>
+          <w:bCs/>
+        </w:rPr>
+        <w:t>descripción: Text</w:t>
       </w:r>
     </w:p>
     <w:p>
@@ -743,52 +687,28 @@
         <w:rPr>
           <w:b/>
           <w:bCs/>
-          <w:color w:val="FF0000"/>
-        </w:rPr>
-      </w:pPr>
-      <w:r>
-        <w:rPr>
-          <w:b/>
-          <w:bCs/>
-          <w:color w:val="FF0000"/>
-        </w:rPr>
-        <w:t xml:space="preserve">Por </w:t>
-      </w:r>
-      <w:proofErr w:type="gramStart"/>
-      <w:r>
-        <w:rPr>
-          <w:b/>
-          <w:bCs/>
-          <w:color w:val="FF0000"/>
-        </w:rPr>
-        <w:t>ejemplo</w:t>
-      </w:r>
-      <w:proofErr w:type="gramEnd"/>
-      <w:r>
-        <w:rPr>
-          <w:b/>
-          <w:bCs/>
-          <w:color w:val="FF0000"/>
-        </w:rPr>
-        <w:t xml:space="preserve"> los </w:t>
-      </w:r>
-      <w:proofErr w:type="spellStart"/>
-      <w:r>
-        <w:rPr>
-          <w:b/>
-          <w:bCs/>
-          <w:color w:val="FF0000"/>
-        </w:rPr>
-        <w:t>KPIs</w:t>
-      </w:r>
-      <w:proofErr w:type="spellEnd"/>
-      <w:r>
-        <w:rPr>
-          <w:b/>
-          <w:bCs/>
-          <w:color w:val="FF0000"/>
-        </w:rPr>
-        <w:t xml:space="preserve"> tiene que poder </w:t>
+        </w:rPr>
+      </w:pPr>
+      <w:r>
+        <w:rPr>
+          <w:b/>
+          <w:bCs/>
+        </w:rPr>
+        <w:t>En titu</w:t>
+      </w:r>
+      <w:r>
+        <w:rPr>
+          <w:b/>
+          <w:bCs/>
+        </w:rPr>
+        <w:t>lar</w:t>
+      </w:r>
+      <w:r>
+        <w:rPr>
+          <w:b/>
+          <w:bCs/>
+        </w:rPr>
+        <w:t>es existirán dos campos:</w:t>
       </w:r>
     </w:p>
     <w:p>
@@ -801,17 +721,63 @@
         <w:rPr>
           <w:b/>
           <w:bCs/>
-          <w:color w:val="FF0000"/>
-        </w:rPr>
-      </w:pPr>
-      <w:r>
-        <w:rPr>
-          <w:b/>
-          <w:bCs/>
-          <w:color w:val="FF0000"/>
-        </w:rPr>
-        <w:t>O reducir su tamaño cuando no se pueda ver su contenido.</w:t>
-      </w:r>
+        </w:rPr>
+      </w:pPr>
+      <w:proofErr w:type="spellStart"/>
+      <w:r>
+        <w:rPr>
+          <w:b/>
+          <w:bCs/>
+        </w:rPr>
+        <w:t>id_tipo</w:t>
+      </w:r>
+      <w:proofErr w:type="spellEnd"/>
+      <w:r>
+        <w:rPr>
+          <w:b/>
+          <w:bCs/>
+        </w:rPr>
+        <w:t xml:space="preserve"> (</w:t>
+      </w:r>
+      <w:proofErr w:type="spellStart"/>
+      <w:r>
+        <w:rPr>
+          <w:b/>
+          <w:bCs/>
+        </w:rPr>
+        <w:t>varchar</w:t>
+      </w:r>
+      <w:proofErr w:type="spellEnd"/>
+      <w:r>
+        <w:rPr>
+          <w:b/>
+          <w:bCs/>
+        </w:rPr>
+        <w:t xml:space="preserve">): Tipo persona </w:t>
+      </w:r>
+      <w:r>
+        <w:rPr>
+          <w:b/>
+          <w:bCs/>
+        </w:rPr>
+        <w:sym w:font="Wingdings" w:char="F0E0"/>
+      </w:r>
+      <w:r>
+        <w:rPr>
+          <w:b/>
+          <w:bCs/>
+        </w:rPr>
+        <w:t xml:space="preserve"> como clave foránea de </w:t>
+      </w:r>
+      <w:proofErr w:type="spellStart"/>
+      <w:r>
+        <w:rPr>
+          <w:b/>
+          <w:bCs/>
+        </w:rPr>
+        <w:t>BdE_Tipos</w:t>
+      </w:r>
+      <w:proofErr w:type="spellEnd"/>
     </w:p>
     <w:p>
       <w:pPr>
@@ -823,17 +789,63 @@
         <w:rPr>
           <w:b/>
           <w:bCs/>
-          <w:color w:val="FF0000"/>
-        </w:rPr>
-      </w:pPr>
-      <w:r>
-        <w:rPr>
-          <w:b/>
-          <w:bCs/>
-          <w:color w:val="FF0000"/>
-        </w:rPr>
-        <w:t>O presentarse en más filas (menos columnas).</w:t>
-      </w:r>
+        </w:rPr>
+      </w:pPr>
+      <w:proofErr w:type="spellStart"/>
+      <w:r>
+        <w:rPr>
+          <w:b/>
+          <w:bCs/>
+        </w:rPr>
+        <w:t>id_sector</w:t>
+      </w:r>
+      <w:proofErr w:type="spellEnd"/>
+      <w:r>
+        <w:rPr>
+          <w:b/>
+          <w:bCs/>
+        </w:rPr>
+        <w:t xml:space="preserve"> (</w:t>
+      </w:r>
+      <w:proofErr w:type="spellStart"/>
+      <w:r>
+        <w:rPr>
+          <w:b/>
+          <w:bCs/>
+        </w:rPr>
+        <w:t>varchar</w:t>
+      </w:r>
+      <w:proofErr w:type="spellEnd"/>
+      <w:r>
+        <w:rPr>
+          <w:b/>
+          <w:bCs/>
+        </w:rPr>
+        <w:t xml:space="preserve">): Sector </w:t>
+      </w:r>
+      <w:r>
+        <w:rPr>
+          <w:b/>
+          <w:bCs/>
+        </w:rPr>
+        <w:sym w:font="Wingdings" w:char="F0E0"/>
+      </w:r>
+      <w:r>
+        <w:rPr>
+          <w:b/>
+          <w:bCs/>
+        </w:rPr>
+        <w:t xml:space="preserve"> como clave foránea de </w:t>
+      </w:r>
+      <w:proofErr w:type="spellStart"/>
+      <w:r>
+        <w:rPr>
+          <w:b/>
+          <w:bCs/>
+        </w:rPr>
+        <w:t>BdE_Sectores</w:t>
+      </w:r>
+      <w:proofErr w:type="spellEnd"/>
     </w:p>
     <w:p>
       <w:pPr>
@@ -845,741 +857,6 @@
         <w:rPr>
           <w:b/>
           <w:bCs/>
-          <w:color w:val="FF0000"/>
-        </w:rPr>
-      </w:pPr>
-      <w:r>
-        <w:rPr>
-          <w:b/>
-          <w:bCs/>
-          <w:color w:val="FF0000"/>
-        </w:rPr>
-        <w:t>También podrían tener una distribución y presentación diferente en función del tamaño del dispositivo.</w:t>
-      </w:r>
-    </w:p>
-    <w:p>
-      <w:pPr>
-        <w:pStyle w:val="Prrafodelista"/>
-        <w:numPr>
-          <w:ilvl w:val="1"/>
-          <w:numId w:val="16"/>
-        </w:numPr>
-        <w:rPr>
-          <w:b/>
-          <w:bCs/>
-          <w:color w:val="FF0000"/>
-        </w:rPr>
-      </w:pPr>
-      <w:r>
-        <w:rPr>
-          <w:b/>
-          <w:bCs/>
-          <w:color w:val="FF0000"/>
-        </w:rPr>
-        <w:t xml:space="preserve">O reducir el contenido o formato, por </w:t>
-      </w:r>
-      <w:proofErr w:type="gramStart"/>
-      <w:r>
-        <w:rPr>
-          <w:b/>
-          <w:bCs/>
-          <w:color w:val="FF0000"/>
-        </w:rPr>
-        <w:t>ejemplo</w:t>
-      </w:r>
-      <w:proofErr w:type="gramEnd"/>
-      <w:r>
-        <w:rPr>
-          <w:b/>
-          <w:bCs/>
-          <w:color w:val="FF0000"/>
-        </w:rPr>
-        <w:t xml:space="preserve"> en dispositivos más pequeños, en el </w:t>
-      </w:r>
-      <w:proofErr w:type="spellStart"/>
-      <w:r>
-        <w:rPr>
-          <w:b/>
-          <w:bCs/>
-          <w:color w:val="FF0000"/>
-        </w:rPr>
-        <w:t>dashboard</w:t>
-      </w:r>
-      <w:proofErr w:type="spellEnd"/>
-      <w:r>
-        <w:rPr>
-          <w:b/>
-          <w:bCs/>
-          <w:color w:val="FF0000"/>
-        </w:rPr>
-        <w:t xml:space="preserve">, presentar los € en miles sin poner € </w:t>
-      </w:r>
-      <w:r>
-        <w:rPr>
-          <w:b/>
-          <w:bCs/>
-          <w:color w:val="FF0000"/>
-        </w:rPr>
-        <w:sym w:font="Wingdings" w:char="F0E0"/>
-      </w:r>
-      <w:r>
-        <w:rPr>
-          <w:b/>
-          <w:bCs/>
-          <w:color w:val="FF0000"/>
-        </w:rPr>
-        <w:t xml:space="preserve"> especificar en la cabecera cifras en K€, no presentar </w:t>
-      </w:r>
-      <w:r>
-        <w:rPr>
-          <w:b/>
-          <w:bCs/>
-          <w:color w:val="FF0000"/>
-        </w:rPr>
-        <w:lastRenderedPageBreak/>
-        <w:t xml:space="preserve">los gráficos </w:t>
-      </w:r>
-      <w:proofErr w:type="spellStart"/>
-      <w:r>
-        <w:rPr>
-          <w:b/>
-          <w:bCs/>
-          <w:color w:val="FF0000"/>
-        </w:rPr>
-        <w:t>de</w:t>
-      </w:r>
-      <w:proofErr w:type="spellEnd"/>
-      <w:r>
-        <w:rPr>
-          <w:b/>
-          <w:bCs/>
-          <w:color w:val="FF0000"/>
-        </w:rPr>
-        <w:t xml:space="preserve"> % de capital y % de capital activo. Esto es un ejemplo, analizar que se puede hacer en toda la aplicación.</w:t>
-      </w:r>
-    </w:p>
-    <w:p>
-      <w:pPr>
-        <w:rPr>
-          <w:b/>
-          <w:bCs/>
-          <w:color w:val="FF0000"/>
-        </w:rPr>
-      </w:pPr>
-    </w:p>
-    <w:p>
-      <w:pPr>
-        <w:pStyle w:val="Prrafodelista"/>
-        <w:ind w:left="1440"/>
-        <w:rPr>
-          <w:b/>
-          <w:bCs/>
-          <w:color w:val="FF0000"/>
-        </w:rPr>
-      </w:pPr>
-    </w:p>
-    <w:p>
-      <w:pPr>
-        <w:pStyle w:val="Prrafodelista"/>
-        <w:numPr>
-          <w:ilvl w:val="0"/>
-          <w:numId w:val="16"/>
-        </w:numPr>
-        <w:rPr>
-          <w:b/>
-          <w:bCs/>
-          <w:color w:val="FF0000"/>
-        </w:rPr>
-      </w:pPr>
-      <w:r>
-        <w:rPr>
-          <w:b/>
-          <w:bCs/>
-          <w:color w:val="FF0000"/>
-        </w:rPr>
-        <w:t>Mejorar su funcionamiento en un móvil. Por ejemplo, en un móvil, el menú de la izquierda no tiene que quedarse fijo.</w:t>
-      </w:r>
-    </w:p>
-    <w:p>
-      <w:pPr>
-        <w:rPr>
-          <w:b/>
-          <w:bCs/>
-          <w:color w:val="FF0000"/>
-        </w:rPr>
-      </w:pPr>
-    </w:p>
-    <w:p>
-      <w:pPr>
-        <w:rPr>
-          <w:b/>
-          <w:bCs/>
-          <w:color w:val="FF0000"/>
-        </w:rPr>
-      </w:pPr>
-      <w:r>
-        <w:rPr>
-          <w:b/>
-          <w:bCs/>
-          <w:color w:val="FF0000"/>
-        </w:rPr>
-        <w:t>Empezar a plantear 2 o 3 entornos:</w:t>
-      </w:r>
-    </w:p>
-    <w:p>
-      <w:pPr>
-        <w:pStyle w:val="Prrafodelista"/>
-        <w:numPr>
-          <w:ilvl w:val="0"/>
-          <w:numId w:val="16"/>
-        </w:numPr>
-        <w:rPr>
-          <w:b/>
-          <w:bCs/>
-          <w:color w:val="FF0000"/>
-        </w:rPr>
-      </w:pPr>
-      <w:r>
-        <w:rPr>
-          <w:b/>
-          <w:bCs/>
-          <w:color w:val="FF0000"/>
-        </w:rPr>
-        <w:t>Desarrollo</w:t>
-      </w:r>
-    </w:p>
-    <w:p>
-      <w:pPr>
-        <w:pStyle w:val="Prrafodelista"/>
-        <w:numPr>
-          <w:ilvl w:val="0"/>
-          <w:numId w:val="16"/>
-        </w:numPr>
-        <w:rPr>
-          <w:b/>
-          <w:bCs/>
-          <w:color w:val="FF0000"/>
-        </w:rPr>
-      </w:pPr>
-      <w:r>
-        <w:rPr>
-          <w:b/>
-          <w:bCs/>
-          <w:color w:val="FF0000"/>
-        </w:rPr>
-        <w:t>Test</w:t>
-      </w:r>
-    </w:p>
-    <w:p>
-      <w:pPr>
-        <w:pStyle w:val="Prrafodelista"/>
-        <w:numPr>
-          <w:ilvl w:val="0"/>
-          <w:numId w:val="16"/>
-        </w:numPr>
-        <w:rPr>
-          <w:b/>
-          <w:bCs/>
-          <w:color w:val="FF0000"/>
-        </w:rPr>
-      </w:pPr>
-      <w:r>
-        <w:rPr>
-          <w:b/>
-          <w:bCs/>
-          <w:color w:val="FF0000"/>
-        </w:rPr>
-        <w:t>Producción</w:t>
-      </w:r>
-    </w:p>
-    <w:p>
-      <w:pPr>
-        <w:rPr>
-          <w:b/>
-          <w:bCs/>
-          <w:color w:val="FF0000"/>
-        </w:rPr>
-      </w:pPr>
-    </w:p>
-    <w:p>
-      <w:pPr>
-        <w:rPr>
-          <w:b/>
-          <w:bCs/>
-          <w:color w:val="FF0000"/>
-        </w:rPr>
-      </w:pPr>
-      <w:r>
-        <w:rPr>
-          <w:b/>
-          <w:bCs/>
-          <w:color w:val="FF0000"/>
-        </w:rPr>
-        <w:t xml:space="preserve">Plantear test de funcionamiento de los calendarios y de determinados </w:t>
-      </w:r>
-      <w:proofErr w:type="spellStart"/>
-      <w:r>
-        <w:rPr>
-          <w:b/>
-          <w:bCs/>
-          <w:color w:val="FF0000"/>
-        </w:rPr>
-        <w:t>KPIs</w:t>
-      </w:r>
-      <w:proofErr w:type="spellEnd"/>
-      <w:r>
-        <w:rPr>
-          <w:b/>
-          <w:bCs/>
-          <w:color w:val="FF0000"/>
-        </w:rPr>
-        <w:t>.</w:t>
-      </w:r>
-    </w:p>
-    <w:p>
-      <w:pPr>
-        <w:rPr>
-          <w:b/>
-          <w:bCs/>
-          <w:color w:val="FF0000"/>
-        </w:rPr>
-      </w:pPr>
-    </w:p>
-    <w:p>
-      <w:pPr>
-        <w:rPr>
-          <w:b/>
-          <w:bCs/>
-          <w:color w:val="FF0000"/>
-        </w:rPr>
-      </w:pPr>
-    </w:p>
-    <w:p>
-      <w:pPr>
-        <w:rPr>
-          <w:b/>
-          <w:bCs/>
-          <w:color w:val="FF0000"/>
-        </w:rPr>
-      </w:pPr>
-    </w:p>
-    <w:p>
-      <w:pPr>
-        <w:rPr>
-          <w:b/>
-          <w:bCs/>
-        </w:rPr>
-      </w:pPr>
-    </w:p>
-    <w:p>
-      <w:pPr>
-        <w:pStyle w:val="Ttulo"/>
-      </w:pPr>
-      <w:r>
-        <w:t>Tema CIRBE</w:t>
-      </w:r>
-    </w:p>
-    <w:p>
-      <w:pPr>
-        <w:rPr>
-          <w:b/>
-          <w:bCs/>
-        </w:rPr>
-      </w:pPr>
-    </w:p>
-    <w:p>
-      <w:pPr>
-        <w:rPr>
-          <w:b/>
-          <w:bCs/>
-        </w:rPr>
-      </w:pPr>
-      <w:r>
-        <w:rPr>
-          <w:b/>
-          <w:bCs/>
-        </w:rPr>
-        <w:t xml:space="preserve">Existirá una tabla </w:t>
-      </w:r>
-      <w:r>
-        <w:rPr>
-          <w:b/>
-          <w:bCs/>
-        </w:rPr>
-        <w:t>con los tipos de identificación</w:t>
-      </w:r>
-    </w:p>
-    <w:p>
-      <w:pPr>
-        <w:pStyle w:val="Prrafodelista"/>
-        <w:numPr>
-          <w:ilvl w:val="0"/>
-          <w:numId w:val="16"/>
-        </w:numPr>
-        <w:rPr>
-          <w:b/>
-          <w:bCs/>
-        </w:rPr>
-      </w:pPr>
-      <w:r>
-        <w:rPr>
-          <w:b/>
-          <w:bCs/>
-        </w:rPr>
-        <w:t>Nombre de la tabla interna</w:t>
-      </w:r>
-    </w:p>
-    <w:p>
-      <w:pPr>
-        <w:pStyle w:val="Prrafodelista"/>
-        <w:numPr>
-          <w:ilvl w:val="1"/>
-          <w:numId w:val="16"/>
-        </w:numPr>
-        <w:rPr>
-          <w:b/>
-          <w:bCs/>
-        </w:rPr>
-      </w:pPr>
-      <w:proofErr w:type="spellStart"/>
-      <w:r>
-        <w:rPr>
-          <w:b/>
-          <w:bCs/>
-        </w:rPr>
-        <w:t>BdE_Tipos_id</w:t>
-      </w:r>
-      <w:proofErr w:type="spellEnd"/>
-    </w:p>
-    <w:p>
-      <w:pPr>
-        <w:pStyle w:val="Prrafodelista"/>
-        <w:numPr>
-          <w:ilvl w:val="2"/>
-          <w:numId w:val="16"/>
-        </w:numPr>
-        <w:rPr>
-          <w:b/>
-          <w:bCs/>
-        </w:rPr>
-      </w:pPr>
-      <w:r>
-        <w:rPr>
-          <w:b/>
-          <w:bCs/>
-        </w:rPr>
-        <w:t xml:space="preserve">id: </w:t>
-      </w:r>
-      <w:proofErr w:type="spellStart"/>
-      <w:r>
-        <w:rPr>
-          <w:b/>
-          <w:bCs/>
-        </w:rPr>
-        <w:t>varchar</w:t>
-      </w:r>
-      <w:proofErr w:type="spellEnd"/>
-    </w:p>
-    <w:p>
-      <w:pPr>
-        <w:pStyle w:val="Prrafodelista"/>
-        <w:numPr>
-          <w:ilvl w:val="2"/>
-          <w:numId w:val="16"/>
-        </w:numPr>
-        <w:rPr>
-          <w:b/>
-          <w:bCs/>
-        </w:rPr>
-      </w:pPr>
-      <w:r>
-        <w:rPr>
-          <w:b/>
-          <w:bCs/>
-        </w:rPr>
-        <w:t>descripción: Text</w:t>
-      </w:r>
-    </w:p>
-    <w:p>
-      <w:pPr>
-        <w:pStyle w:val="Prrafodelista"/>
-        <w:numPr>
-          <w:ilvl w:val="0"/>
-          <w:numId w:val="16"/>
-        </w:numPr>
-        <w:rPr>
-          <w:b/>
-          <w:bCs/>
-        </w:rPr>
-      </w:pPr>
-      <w:r>
-        <w:rPr>
-          <w:b/>
-          <w:bCs/>
-        </w:rPr>
-        <w:t>Nombre de otra tabla interna:</w:t>
-      </w:r>
-    </w:p>
-    <w:p>
-      <w:pPr>
-        <w:pStyle w:val="Prrafodelista"/>
-        <w:numPr>
-          <w:ilvl w:val="1"/>
-          <w:numId w:val="16"/>
-        </w:numPr>
-        <w:rPr>
-          <w:b/>
-          <w:bCs/>
-        </w:rPr>
-      </w:pPr>
-      <w:proofErr w:type="spellStart"/>
-      <w:r>
-        <w:rPr>
-          <w:b/>
-          <w:bCs/>
-        </w:rPr>
-        <w:t>BdE_Sectores</w:t>
-      </w:r>
-      <w:proofErr w:type="spellEnd"/>
-    </w:p>
-    <w:p>
-      <w:pPr>
-        <w:pStyle w:val="Prrafodelista"/>
-        <w:numPr>
-          <w:ilvl w:val="2"/>
-          <w:numId w:val="16"/>
-        </w:numPr>
-        <w:rPr>
-          <w:b/>
-          <w:bCs/>
-        </w:rPr>
-      </w:pPr>
-      <w:proofErr w:type="spellStart"/>
-      <w:r>
-        <w:rPr>
-          <w:b/>
-          <w:bCs/>
-        </w:rPr>
-        <w:t>codigo</w:t>
-      </w:r>
-      <w:proofErr w:type="spellEnd"/>
-      <w:r>
-        <w:rPr>
-          <w:b/>
-          <w:bCs/>
-        </w:rPr>
-        <w:t xml:space="preserve">: </w:t>
-      </w:r>
-      <w:proofErr w:type="spellStart"/>
-      <w:r>
-        <w:rPr>
-          <w:b/>
-          <w:bCs/>
-        </w:rPr>
-        <w:t>varchar</w:t>
-      </w:r>
-      <w:proofErr w:type="spellEnd"/>
-    </w:p>
-    <w:p>
-      <w:pPr>
-        <w:pStyle w:val="Prrafodelista"/>
-        <w:numPr>
-          <w:ilvl w:val="2"/>
-          <w:numId w:val="16"/>
-        </w:numPr>
-        <w:rPr>
-          <w:b/>
-          <w:bCs/>
-        </w:rPr>
-      </w:pPr>
-      <w:r>
-        <w:rPr>
-          <w:b/>
-          <w:bCs/>
-        </w:rPr>
-        <w:t>descripción: Text</w:t>
-      </w:r>
-    </w:p>
-    <w:p>
-      <w:pPr>
-        <w:pStyle w:val="Prrafodelista"/>
-        <w:numPr>
-          <w:ilvl w:val="0"/>
-          <w:numId w:val="16"/>
-        </w:numPr>
-        <w:rPr>
-          <w:b/>
-          <w:bCs/>
-        </w:rPr>
-      </w:pPr>
-      <w:r>
-        <w:rPr>
-          <w:b/>
-          <w:bCs/>
-        </w:rPr>
-        <w:t>En titu</w:t>
-      </w:r>
-      <w:r>
-        <w:rPr>
-          <w:b/>
-          <w:bCs/>
-        </w:rPr>
-        <w:t>lar</w:t>
-      </w:r>
-      <w:r>
-        <w:rPr>
-          <w:b/>
-          <w:bCs/>
-        </w:rPr>
-        <w:t>es existirán dos campos:</w:t>
-      </w:r>
-    </w:p>
-    <w:p>
-      <w:pPr>
-        <w:pStyle w:val="Prrafodelista"/>
-        <w:numPr>
-          <w:ilvl w:val="1"/>
-          <w:numId w:val="16"/>
-        </w:numPr>
-        <w:rPr>
-          <w:b/>
-          <w:bCs/>
-        </w:rPr>
-      </w:pPr>
-      <w:proofErr w:type="spellStart"/>
-      <w:r>
-        <w:rPr>
-          <w:b/>
-          <w:bCs/>
-        </w:rPr>
-        <w:t>id_tipo</w:t>
-      </w:r>
-      <w:proofErr w:type="spellEnd"/>
-      <w:r>
-        <w:rPr>
-          <w:b/>
-          <w:bCs/>
-        </w:rPr>
-        <w:t xml:space="preserve"> (</w:t>
-      </w:r>
-      <w:proofErr w:type="spellStart"/>
-      <w:r>
-        <w:rPr>
-          <w:b/>
-          <w:bCs/>
-        </w:rPr>
-        <w:t>varchar</w:t>
-      </w:r>
-      <w:proofErr w:type="spellEnd"/>
-      <w:r>
-        <w:rPr>
-          <w:b/>
-          <w:bCs/>
-        </w:rPr>
-        <w:t xml:space="preserve">): Tipo persona </w:t>
-      </w:r>
-      <w:r>
-        <w:rPr>
-          <w:b/>
-          <w:bCs/>
-        </w:rPr>
-        <w:sym w:font="Wingdings" w:char="F0E0"/>
-      </w:r>
-      <w:r>
-        <w:rPr>
-          <w:b/>
-          <w:bCs/>
-        </w:rPr>
-        <w:t xml:space="preserve"> como clave foránea de </w:t>
-      </w:r>
-      <w:proofErr w:type="spellStart"/>
-      <w:r>
-        <w:rPr>
-          <w:b/>
-          <w:bCs/>
-        </w:rPr>
-        <w:t>BdE_Tipos</w:t>
-      </w:r>
-      <w:proofErr w:type="spellEnd"/>
-    </w:p>
-    <w:p>
-      <w:pPr>
-        <w:pStyle w:val="Prrafodelista"/>
-        <w:numPr>
-          <w:ilvl w:val="1"/>
-          <w:numId w:val="16"/>
-        </w:numPr>
-        <w:rPr>
-          <w:b/>
-          <w:bCs/>
-        </w:rPr>
-      </w:pPr>
-      <w:proofErr w:type="spellStart"/>
-      <w:r>
-        <w:rPr>
-          <w:b/>
-          <w:bCs/>
-        </w:rPr>
-        <w:t>id_sector</w:t>
-      </w:r>
-      <w:proofErr w:type="spellEnd"/>
-      <w:r>
-        <w:rPr>
-          <w:b/>
-          <w:bCs/>
-        </w:rPr>
-        <w:t xml:space="preserve"> (</w:t>
-      </w:r>
-      <w:proofErr w:type="spellStart"/>
-      <w:r>
-        <w:rPr>
-          <w:b/>
-          <w:bCs/>
-        </w:rPr>
-        <w:t>varchar</w:t>
-      </w:r>
-      <w:proofErr w:type="spellEnd"/>
-      <w:r>
-        <w:rPr>
-          <w:b/>
-          <w:bCs/>
-        </w:rPr>
-        <w:t xml:space="preserve">): Sector </w:t>
-      </w:r>
-      <w:r>
-        <w:rPr>
-          <w:b/>
-          <w:bCs/>
-        </w:rPr>
-        <w:sym w:font="Wingdings" w:char="F0E0"/>
-      </w:r>
-      <w:r>
-        <w:rPr>
-          <w:b/>
-          <w:bCs/>
-        </w:rPr>
-        <w:t xml:space="preserve"> como clave foránea de </w:t>
-      </w:r>
-      <w:proofErr w:type="spellStart"/>
-      <w:r>
-        <w:rPr>
-          <w:b/>
-          <w:bCs/>
-        </w:rPr>
-        <w:t>BdE_Sectores</w:t>
-      </w:r>
-      <w:proofErr w:type="spellEnd"/>
-    </w:p>
-    <w:p>
-      <w:pPr>
-        <w:pStyle w:val="Prrafodelista"/>
-        <w:numPr>
-          <w:ilvl w:val="1"/>
-          <w:numId w:val="16"/>
-        </w:numPr>
-        <w:rPr>
-          <w:b/>
-          <w:bCs/>
         </w:rPr>
       </w:pPr>
     </w:p>
@@ -1676,7 +953,6 @@
         </w:numPr>
       </w:pPr>
       <w:r>
-        <w:lastRenderedPageBreak/>
         <w:t xml:space="preserve">Todos los ID de la aplicación </w:t>
       </w:r>
       <w:proofErr w:type="gramStart"/>
@@ -2111,6 +1387,7 @@
         <w:pStyle w:val="Ttulo1"/>
       </w:pPr>
       <w:r>
+        <w:lastRenderedPageBreak/>
         <w:t>Modelo de negocio (por si hay que recordarlo):</w:t>
       </w:r>
     </w:p>
@@ -2213,7 +1490,6 @@
           <w:rFonts w:ascii="Cambria" w:hAnsi="Cambria" w:cs="Apple Color Emoji"/>
           <w:color w:val="4C94D8" w:themeColor="text2" w:themeTint="80"/>
         </w:rPr>
-        <w:lastRenderedPageBreak/>
         <w:t>Cuando se crea un contrato CCP</w:t>
       </w:r>
       <w:r>
@@ -7712,6 +6988,7 @@
   <w:style w:type="character" w:default="1" w:styleId="Fuentedeprrafopredeter">
     <w:name w:val="Default Paragraph Font"/>
     <w:uiPriority w:val="1"/>
+    <w:semiHidden/>
     <w:unhideWhenUsed/>
   </w:style>
   <w:style w:type="table" w:default="1" w:styleId="Tablanormal">

</xml_diff>

<commit_message>
Pulir gestión de usuarios.
</commit_message>
<xml_diff>
--- a/documentación/Mejoras propuestas préstamos.docx
+++ b/documentación/Mejoras propuestas préstamos.docx
@@ -42,271 +42,6 @@
           <w:color w:val="FF0000"/>
         </w:rPr>
         <w:t>MEJORAS:</w:t>
-      </w:r>
-    </w:p>
-    <w:p>
-      <w:pPr>
-        <w:rPr>
-          <w:color w:val="FF0000"/>
-        </w:rPr>
-      </w:pPr>
-    </w:p>
-    <w:p>
-      <w:pPr>
-        <w:rPr>
-          <w:color w:val="FF0000"/>
-        </w:rPr>
-      </w:pPr>
-    </w:p>
-    <w:p>
-      <w:pPr>
-        <w:rPr>
-          <w:b/>
-          <w:bCs/>
-          <w:color w:val="FF0000"/>
-        </w:rPr>
-      </w:pPr>
-      <w:r>
-        <w:rPr>
-          <w:b/>
-          <w:bCs/>
-          <w:color w:val="FF0000"/>
-        </w:rPr>
-        <w:t>Incoherencias detectadas</w:t>
-      </w:r>
-      <w:r>
-        <w:rPr>
-          <w:b/>
-          <w:bCs/>
-          <w:color w:val="FF0000"/>
-        </w:rPr>
-        <w:t xml:space="preserve"> </w:t>
-      </w:r>
-      <w:r>
-        <w:rPr>
-          <w:b/>
-          <w:bCs/>
-          <w:color w:val="FF0000"/>
-        </w:rPr>
-        <w:sym w:font="Wingdings" w:char="F0E0"/>
-      </w:r>
-      <w:r>
-        <w:rPr>
-          <w:b/>
-          <w:bCs/>
-          <w:color w:val="FF0000"/>
-        </w:rPr>
-        <w:t xml:space="preserve"> VER EXCEL</w:t>
-      </w:r>
-    </w:p>
-    <w:p>
-      <w:pPr>
-        <w:rPr>
-          <w:b/>
-          <w:bCs/>
-          <w:color w:val="FF0000"/>
-        </w:rPr>
-      </w:pPr>
-    </w:p>
-    <w:p>
-      <w:pPr>
-        <w:rPr>
-          <w:b/>
-          <w:bCs/>
-          <w:color w:val="FF0000"/>
-        </w:rPr>
-      </w:pPr>
-    </w:p>
-    <w:p>
-      <w:pPr>
-        <w:rPr>
-          <w:color w:val="FF0000"/>
-        </w:rPr>
-      </w:pPr>
-    </w:p>
-    <w:p>
-      <w:pPr>
-        <w:rPr>
-          <w:color w:val="FF0000"/>
-        </w:rPr>
-      </w:pPr>
-    </w:p>
-    <w:p>
-      <w:pPr>
-        <w:rPr>
-          <w:color w:val="FF0000"/>
-        </w:rPr>
-      </w:pPr>
-      <w:proofErr w:type="spellStart"/>
-      <w:r>
-        <w:rPr>
-          <w:color w:val="FF0000"/>
-        </w:rPr>
-        <w:t>KPIs</w:t>
-      </w:r>
-      <w:proofErr w:type="spellEnd"/>
-      <w:r>
-        <w:rPr>
-          <w:color w:val="FF0000"/>
-        </w:rPr>
-        <w:t xml:space="preserve"> </w:t>
-      </w:r>
-      <w:r>
-        <w:rPr>
-          <w:color w:val="FF0000"/>
-        </w:rPr>
-        <w:t xml:space="preserve">de la pantalla Partícipes </w:t>
-      </w:r>
-      <w:r>
-        <w:rPr>
-          <w:color w:val="FF0000"/>
-        </w:rPr>
-        <w:t xml:space="preserve">y </w:t>
-      </w:r>
-      <w:proofErr w:type="gramStart"/>
-      <w:r>
-        <w:rPr>
-          <w:color w:val="FF0000"/>
-        </w:rPr>
-        <w:t xml:space="preserve">Contratos </w:t>
-      </w:r>
-      <w:r>
-        <w:rPr>
-          <w:color w:val="FF0000"/>
-        </w:rPr>
-        <w:t>:</w:t>
-      </w:r>
-      <w:proofErr w:type="gramEnd"/>
-      <w:r>
-        <w:rPr>
-          <w:color w:val="FF0000"/>
-        </w:rPr>
-        <w:t xml:space="preserve"> </w:t>
-      </w:r>
-    </w:p>
-    <w:p>
-      <w:pPr>
-        <w:rPr>
-          <w:color w:val="FF0000"/>
-        </w:rPr>
-      </w:pPr>
-    </w:p>
-    <w:p>
-      <w:pPr>
-        <w:rPr>
-          <w:color w:val="FF0000"/>
-        </w:rPr>
-      </w:pPr>
-      <w:r>
-        <w:rPr>
-          <w:color w:val="FF0000"/>
-        </w:rPr>
-        <w:t>CAPITAL PARTICIPADO</w:t>
-      </w:r>
-    </w:p>
-    <w:p>
-      <w:pPr>
-        <w:pStyle w:val="Prrafodelista"/>
-        <w:numPr>
-          <w:ilvl w:val="0"/>
-          <w:numId w:val="1"/>
-        </w:numPr>
-        <w:rPr>
-          <w:color w:val="FF0000"/>
-        </w:rPr>
-      </w:pPr>
-      <w:r>
-        <w:rPr>
-          <w:color w:val="FF0000"/>
-        </w:rPr>
-        <w:t>Todas las cifras en blanco</w:t>
-      </w:r>
-      <w:r>
-        <w:rPr>
-          <w:color w:val="FF0000"/>
-        </w:rPr>
-        <w:t xml:space="preserve"> </w:t>
-      </w:r>
-      <w:r>
-        <w:rPr>
-          <w:color w:val="FF0000"/>
-        </w:rPr>
-        <w:sym w:font="Wingdings" w:char="F0E0"/>
-      </w:r>
-      <w:r>
-        <w:rPr>
-          <w:color w:val="FF0000"/>
-        </w:rPr>
-        <w:t xml:space="preserve"> Retraso sale en naranja y Judicializado en rojo.</w:t>
-      </w:r>
-    </w:p>
-    <w:p>
-      <w:pPr>
-        <w:rPr>
-          <w:color w:val="FF0000"/>
-        </w:rPr>
-      </w:pPr>
-      <w:r>
-        <w:rPr>
-          <w:color w:val="FF0000"/>
-        </w:rPr>
-        <w:t>RENTABILIDAD PROMOCIMA:</w:t>
-      </w:r>
-    </w:p>
-    <w:p>
-      <w:pPr>
-        <w:pStyle w:val="Prrafodelista"/>
-        <w:numPr>
-          <w:ilvl w:val="0"/>
-          <w:numId w:val="6"/>
-        </w:numPr>
-        <w:rPr>
-          <w:color w:val="FF0000"/>
-        </w:rPr>
-      </w:pPr>
-      <w:r>
-        <w:rPr>
-          <w:color w:val="FF0000"/>
-        </w:rPr>
-        <w:t>El total de la parte superior tiene que ser la suma de Gestión + apertura</w:t>
-      </w:r>
-    </w:p>
-    <w:p>
-      <w:pPr>
-        <w:pStyle w:val="Prrafodelista"/>
-        <w:numPr>
-          <w:ilvl w:val="0"/>
-          <w:numId w:val="6"/>
-        </w:numPr>
-        <w:rPr>
-          <w:color w:val="FF0000"/>
-        </w:rPr>
-      </w:pPr>
-      <w:r>
-        <w:rPr>
-          <w:color w:val="FF0000"/>
-        </w:rPr>
-        <w:t xml:space="preserve">En </w:t>
-      </w:r>
-      <w:r>
-        <w:rPr>
-          <w:color w:val="FF0000"/>
-        </w:rPr>
-        <w:t xml:space="preserve">Rentabilidad sobre capital PROMOCIMA: </w:t>
-      </w:r>
-      <w:proofErr w:type="spellStart"/>
-      <w:r>
-        <w:rPr>
-          <w:color w:val="FF0000"/>
-        </w:rPr>
-        <w:t>Explicame</w:t>
-      </w:r>
-      <w:proofErr w:type="spellEnd"/>
-      <w:r>
-        <w:rPr>
-          <w:color w:val="FF0000"/>
-        </w:rPr>
-        <w:t xml:space="preserve"> como aplicas la fórmula.</w:t>
       </w:r>
     </w:p>
     <w:p>
@@ -418,6 +153,7 @@
     <w:p/>
     <w:p>
       <w:r>
+        <w:lastRenderedPageBreak/>
         <w:t>Antes de aplicar este cambio pregúntame lo que no te quede claro.</w:t>
       </w:r>
     </w:p>
@@ -1729,6 +1465,7 @@
   <w:style w:type="character" w:default="1" w:styleId="Fuentedeprrafopredeter">
     <w:name w:val="Default Paragraph Font"/>
     <w:uiPriority w:val="1"/>
+    <w:semiHidden/>
     <w:unhideWhenUsed/>
   </w:style>
   <w:style w:type="table" w:default="1" w:styleId="Tablanormal">

</xml_diff>

<commit_message>
Se ha añadido la posibilidad de trabajar en dos entornos de base de datos: Producción y pruebas. Se ha añadido backup y restore de base de datos
</commit_message>
<xml_diff>
--- a/documentación/Mejoras propuestas préstamos.docx
+++ b/documentación/Mejoras propuestas préstamos.docx
@@ -29,6 +29,113 @@
           <w:color w:val="FF0000"/>
         </w:rPr>
       </w:pPr>
+      <w:r>
+        <w:rPr>
+          <w:color w:val="FF0000"/>
+        </w:rPr>
+        <w:t>Otro tema, en el m</w:t>
+      </w:r>
+      <w:r>
+        <w:rPr>
+          <w:color w:val="FF0000"/>
+        </w:rPr>
+        <w:t>ó</w:t>
+      </w:r>
+      <w:r>
+        <w:rPr>
+          <w:color w:val="FF0000"/>
+        </w:rPr>
+        <w:t xml:space="preserve">vil, cuando lo veo en vertical, funciona correctamente (excepto la primera visualización que sale como ya te he mostrado antes sale con un tamaño en el que los </w:t>
+      </w:r>
+      <w:proofErr w:type="spellStart"/>
+      <w:r>
+        <w:rPr>
+          <w:color w:val="FF0000"/>
+        </w:rPr>
+        <w:t>KPIs</w:t>
+      </w:r>
+      <w:proofErr w:type="spellEnd"/>
+      <w:r>
+        <w:rPr>
+          <w:color w:val="FF0000"/>
+        </w:rPr>
+        <w:t xml:space="preserve"> no caben en la pantalla de ancho). Pero cuando pongo el </w:t>
+      </w:r>
+      <w:proofErr w:type="spellStart"/>
+      <w:r>
+        <w:rPr>
+          <w:color w:val="FF0000"/>
+        </w:rPr>
+        <w:t>movil</w:t>
+      </w:r>
+      <w:proofErr w:type="spellEnd"/>
+      <w:r>
+        <w:rPr>
+          <w:color w:val="FF0000"/>
+        </w:rPr>
+        <w:t xml:space="preserve"> en horizontal, en el caso del portal, si de una tabla no caben todas las columnas en la pantalla, no me permite hacer </w:t>
+      </w:r>
+      <w:proofErr w:type="spellStart"/>
+      <w:r>
+        <w:rPr>
+          <w:color w:val="FF0000"/>
+        </w:rPr>
+        <w:t>scroll</w:t>
+      </w:r>
+      <w:proofErr w:type="spellEnd"/>
+      <w:r>
+        <w:rPr>
+          <w:color w:val="FF0000"/>
+        </w:rPr>
+        <w:t xml:space="preserve"> horizontal de esa tabla para ver las columnas de la derecha.</w:t>
+      </w:r>
+    </w:p>
+    <w:p>
+      <w:pPr>
+        <w:rPr>
+          <w:color w:val="FF0000"/>
+        </w:rPr>
+      </w:pPr>
+    </w:p>
+    <w:p>
+      <w:pPr>
+        <w:pStyle w:val="Prrafodelista"/>
+        <w:numPr>
+          <w:ilvl w:val="0"/>
+          <w:numId w:val="7"/>
+        </w:numPr>
+        <w:rPr>
+          <w:color w:val="FF0000"/>
+        </w:rPr>
+      </w:pPr>
+      <w:r>
+        <w:rPr>
+          <w:color w:val="FF0000"/>
+        </w:rPr>
+        <w:t xml:space="preserve">En Partícipes al seleccionar </w:t>
+      </w:r>
+      <w:proofErr w:type="gramStart"/>
+      <w:r>
+        <w:rPr>
+          <w:color w:val="FF0000"/>
+        </w:rPr>
+        <w:t>un partícipes</w:t>
+      </w:r>
+      <w:proofErr w:type="gramEnd"/>
+      <w:r>
+        <w:rPr>
+          <w:color w:val="FF0000"/>
+        </w:rPr>
+        <w:t>, eliminar el botón de la derecha de ver contratos CCP, ya que se ven debajo.</w:t>
+      </w:r>
+    </w:p>
+    <w:p>
+      <w:pPr>
+        <w:ind w:left="360"/>
+        <w:rPr>
+          <w:color w:val="FF0000"/>
+        </w:rPr>
+      </w:pPr>
     </w:p>
     <w:p>
       <w:pPr>
@@ -60,6 +167,22 @@
           <w:color w:val="FF0000"/>
         </w:rPr>
       </w:pPr>
+      <w:r>
+        <w:rPr>
+          <w:color w:val="FF0000"/>
+        </w:rPr>
+        <w:t>Cuando accedo a la ficha del Contrato CCP, en la parte que se refiere a préstamo vinculado, tendría que verse la fecha de firma del préstamo.</w:t>
+      </w:r>
+    </w:p>
+    <w:p>
+      <w:pPr>
+        <w:pBdr>
+          <w:bottom w:val="single" w:sz="6" w:space="1" w:color="auto"/>
+        </w:pBdr>
+        <w:rPr>
+          <w:color w:val="FF0000"/>
+        </w:rPr>
+      </w:pPr>
     </w:p>
     <w:p/>
     <w:p>
@@ -89,6 +212,20 @@
       </w:r>
     </w:p>
     <w:p>
+      <w:r>
+        <w:t xml:space="preserve">También hay que añadir </w:t>
+      </w:r>
+      <w:proofErr w:type="spellStart"/>
+      <w:r>
+        <w:t>tests</w:t>
+      </w:r>
+      <w:proofErr w:type="spellEnd"/>
+      <w:r>
+        <w:t xml:space="preserve"> del impacto de la fecha de cierre en el portal del empleado.</w:t>
+      </w:r>
+    </w:p>
+    <w:p/>
+    <w:p>
       <w:pPr>
         <w:pBdr>
           <w:bottom w:val="single" w:sz="6" w:space="1" w:color="auto"/>
@@ -110,6 +247,7 @@
     <w:p/>
     <w:p>
       <w:r>
+        <w:lastRenderedPageBreak/>
         <w:t>En principio cada usuario tiene que poder acceder a una empresa y eso lo determinará el administrador en el perfil del usuario.</w:t>
       </w:r>
     </w:p>
@@ -153,7 +291,6 @@
     <w:p/>
     <w:p>
       <w:r>
-        <w:lastRenderedPageBreak/>
         <w:t>Antes de aplicar este cambio pregúntame lo que no te quede claro.</w:t>
       </w:r>
     </w:p>
@@ -282,6 +419,95 @@
     </w:lvl>
   </w:abstractNum>
   <w:abstractNum w:abstractNumId="1" w15:restartNumberingAfterBreak="0">
+    <w:nsid w:val="2C2E1BB8"/>
+    <w:multiLevelType w:val="hybridMultilevel"/>
+    <w:tmpl w:val="9EB29886"/>
+    <w:lvl w:ilvl="0" w:tplc="040A000F">
+      <w:start w:val="1"/>
+      <w:numFmt w:val="decimal"/>
+      <w:lvlText w:val="%1."/>
+      <w:lvlJc w:val="left"/>
+      <w:pPr>
+        <w:ind w:left="720" w:hanging="360"/>
+      </w:pPr>
+      <w:rPr>
+        <w:rFonts w:hint="default"/>
+      </w:rPr>
+    </w:lvl>
+    <w:lvl w:ilvl="1" w:tplc="040A0019" w:tentative="1">
+      <w:start w:val="1"/>
+      <w:numFmt w:val="lowerLetter"/>
+      <w:lvlText w:val="%2."/>
+      <w:lvlJc w:val="left"/>
+      <w:pPr>
+        <w:ind w:left="1440" w:hanging="360"/>
+      </w:pPr>
+    </w:lvl>
+    <w:lvl w:ilvl="2" w:tplc="040A001B" w:tentative="1">
+      <w:start w:val="1"/>
+      <w:numFmt w:val="lowerRoman"/>
+      <w:lvlText w:val="%3."/>
+      <w:lvlJc w:val="right"/>
+      <w:pPr>
+        <w:ind w:left="2160" w:hanging="180"/>
+      </w:pPr>
+    </w:lvl>
+    <w:lvl w:ilvl="3" w:tplc="040A000F" w:tentative="1">
+      <w:start w:val="1"/>
+      <w:numFmt w:val="decimal"/>
+      <w:lvlText w:val="%4."/>
+      <w:lvlJc w:val="left"/>
+      <w:pPr>
+        <w:ind w:left="2880" w:hanging="360"/>
+      </w:pPr>
+    </w:lvl>
+    <w:lvl w:ilvl="4" w:tplc="040A0019" w:tentative="1">
+      <w:start w:val="1"/>
+      <w:numFmt w:val="lowerLetter"/>
+      <w:lvlText w:val="%5."/>
+      <w:lvlJc w:val="left"/>
+      <w:pPr>
+        <w:ind w:left="3600" w:hanging="360"/>
+      </w:pPr>
+    </w:lvl>
+    <w:lvl w:ilvl="5" w:tplc="040A001B" w:tentative="1">
+      <w:start w:val="1"/>
+      <w:numFmt w:val="lowerRoman"/>
+      <w:lvlText w:val="%6."/>
+      <w:lvlJc w:val="right"/>
+      <w:pPr>
+        <w:ind w:left="4320" w:hanging="180"/>
+      </w:pPr>
+    </w:lvl>
+    <w:lvl w:ilvl="6" w:tplc="040A000F" w:tentative="1">
+      <w:start w:val="1"/>
+      <w:numFmt w:val="decimal"/>
+      <w:lvlText w:val="%7."/>
+      <w:lvlJc w:val="left"/>
+      <w:pPr>
+        <w:ind w:left="5040" w:hanging="360"/>
+      </w:pPr>
+    </w:lvl>
+    <w:lvl w:ilvl="7" w:tplc="040A0019" w:tentative="1">
+      <w:start w:val="1"/>
+      <w:numFmt w:val="lowerLetter"/>
+      <w:lvlText w:val="%8."/>
+      <w:lvlJc w:val="left"/>
+      <w:pPr>
+        <w:ind w:left="5760" w:hanging="360"/>
+      </w:pPr>
+    </w:lvl>
+    <w:lvl w:ilvl="8" w:tplc="040A001B" w:tentative="1">
+      <w:start w:val="1"/>
+      <w:numFmt w:val="lowerRoman"/>
+      <w:lvlText w:val="%9."/>
+      <w:lvlJc w:val="right"/>
+      <w:pPr>
+        <w:ind w:left="6480" w:hanging="180"/>
+      </w:pPr>
+    </w:lvl>
+  </w:abstractNum>
+  <w:abstractNum w:abstractNumId="2" w15:restartNumberingAfterBreak="0">
     <w:nsid w:val="36FE74A4"/>
     <w:multiLevelType w:val="hybridMultilevel"/>
     <w:tmpl w:val="14AC6A5A"/>
@@ -393,7 +619,7 @@
       </w:rPr>
     </w:lvl>
   </w:abstractNum>
-  <w:abstractNum w:abstractNumId="2" w15:restartNumberingAfterBreak="0">
+  <w:abstractNum w:abstractNumId="3" w15:restartNumberingAfterBreak="0">
     <w:nsid w:val="3DB3416A"/>
     <w:multiLevelType w:val="hybridMultilevel"/>
     <w:tmpl w:val="81DA2852"/>
@@ -505,7 +731,7 @@
       </w:rPr>
     </w:lvl>
   </w:abstractNum>
-  <w:abstractNum w:abstractNumId="3" w15:restartNumberingAfterBreak="0">
+  <w:abstractNum w:abstractNumId="4" w15:restartNumberingAfterBreak="0">
     <w:nsid w:val="636D118E"/>
     <w:multiLevelType w:val="hybridMultilevel"/>
     <w:tmpl w:val="4BBCE546"/>
@@ -618,7 +844,7 @@
       </w:rPr>
     </w:lvl>
   </w:abstractNum>
-  <w:abstractNum w:abstractNumId="4" w15:restartNumberingAfterBreak="0">
+  <w:abstractNum w:abstractNumId="5" w15:restartNumberingAfterBreak="0">
     <w:nsid w:val="65D60298"/>
     <w:multiLevelType w:val="hybridMultilevel"/>
     <w:tmpl w:val="6B702038"/>
@@ -731,7 +957,7 @@
       </w:rPr>
     </w:lvl>
   </w:abstractNum>
-  <w:abstractNum w:abstractNumId="5" w15:restartNumberingAfterBreak="0">
+  <w:abstractNum w:abstractNumId="6" w15:restartNumberingAfterBreak="0">
     <w:nsid w:val="780C4083"/>
     <w:multiLevelType w:val="hybridMultilevel"/>
     <w:tmpl w:val="62A01B32"/>
@@ -845,22 +1071,25 @@
     </w:lvl>
   </w:abstractNum>
   <w:num w:numId="1" w16cid:durableId="554977000">
+    <w:abstractNumId w:val="5"/>
+  </w:num>
+  <w:num w:numId="2" w16cid:durableId="62409315">
+    <w:abstractNumId w:val="6"/>
+  </w:num>
+  <w:num w:numId="3" w16cid:durableId="70540389">
     <w:abstractNumId w:val="4"/>
   </w:num>
-  <w:num w:numId="2" w16cid:durableId="62409315">
-    <w:abstractNumId w:val="5"/>
-  </w:num>
-  <w:num w:numId="3" w16cid:durableId="70540389">
+  <w:num w:numId="4" w16cid:durableId="53555434">
     <w:abstractNumId w:val="3"/>
   </w:num>
-  <w:num w:numId="4" w16cid:durableId="53555434">
+  <w:num w:numId="5" w16cid:durableId="1568686986">
     <w:abstractNumId w:val="2"/>
-  </w:num>
-  <w:num w:numId="5" w16cid:durableId="1568686986">
-    <w:abstractNumId w:val="1"/>
   </w:num>
   <w:num w:numId="6" w16cid:durableId="811479634">
     <w:abstractNumId w:val="0"/>
+  </w:num>
+  <w:num w:numId="7" w16cid:durableId="991106210">
+    <w:abstractNumId w:val="1"/>
   </w:num>
 </w:numbering>
 </file>
@@ -1465,7 +1694,6 @@
   <w:style w:type="character" w:default="1" w:styleId="Fuentedeprrafopredeter">
     <w:name w:val="Default Paragraph Font"/>
     <w:uiPriority w:val="1"/>
-    <w:semiHidden/>
     <w:unhideWhenUsed/>
   </w:style>
   <w:style w:type="table" w:default="1" w:styleId="Tablanormal">

</xml_diff>